<commit_message>
make configurations and configure H2 database for testing
</commit_message>
<xml_diff>
--- a/Microservices Project using Spring Boot.docx
+++ b/Microservices Project using Spring Boot.docx
@@ -152,7 +152,7 @@
                     </pic:cNvPicPr>
                   </pic:nvPicPr>
                   <pic:blipFill>
-                    <a:blip r:embed="rId5" cstate="print">
+                    <a:blip r:embed="rId6" cstate="print">
                       <a:extLst>
                         <a:ext uri="{28A0092B-C50C-407E-A947-70E740481C1C}">
                           <a14:useLocalDpi xmlns:a14="http://schemas.microsoft.com/office/drawing/2010/main" val="0"/>
@@ -384,7 +384,7 @@
       <w:r>
         <w:t xml:space="preserve">Let's create a student microservice as a Spring boot project using the </w:t>
       </w:r>
-      <w:hyperlink r:id="rId6" w:history="1">
+      <w:hyperlink r:id="rId7" w:history="1">
         <w:r>
           <w:rPr>
             <w:rStyle w:val="Hyperlink"/>
@@ -433,7 +433,7 @@
                     </pic:cNvPicPr>
                   </pic:nvPicPr>
                   <pic:blipFill>
-                    <a:blip r:embed="rId7" cstate="print">
+                    <a:blip r:embed="rId8" cstate="print">
                       <a:extLst>
                         <a:ext uri="{28A0092B-C50C-407E-A947-70E740481C1C}">
                           <a14:useLocalDpi xmlns:a14="http://schemas.microsoft.com/office/drawing/2010/main" val="0"/>
@@ -3355,6 +3355,2909 @@
       </w:pPr>
       <w:r>
         <w:t>That's completed our student microservice development.</w:t>
+      </w:r>
+    </w:p>
+    <w:p>
+      <w:pPr>
+        <w:rPr>
+          <w:sz w:val="24"/>
+          <w:szCs w:val="24"/>
+        </w:rPr>
+      </w:pPr>
+      <w:r>
+        <w:br w:type="page"/>
+      </w:r>
+    </w:p>
+    <w:p>
+      <w:pPr>
+        <w:pStyle w:val="headersub"/>
+      </w:pPr>
+      <w:r>
+        <w:lastRenderedPageBreak/>
+        <w:t>Create School Microservice</w:t>
+      </w:r>
+    </w:p>
+    <w:p>
+      <w:pPr>
+        <w:pStyle w:val="paragraph"/>
+      </w:pPr>
+      <w:r>
+        <w:t>Let's build a school microservice step by step.</w:t>
+      </w:r>
+    </w:p>
+    <w:p>
+      <w:pPr>
+        <w:pStyle w:val="subjects"/>
+      </w:pPr>
+      <w:r>
+        <w:t>Create Spring Boot Project</w:t>
+      </w:r>
+    </w:p>
+    <w:p>
+      <w:pPr>
+        <w:pStyle w:val="paragraph"/>
+      </w:pPr>
+      <w:r>
+        <w:t xml:space="preserve">Let's create a school microservice as a Spring boot project using the spring </w:t>
+      </w:r>
+      <w:proofErr w:type="spellStart"/>
+      <w:r>
+        <w:t>initializr</w:t>
+      </w:r>
+      <w:proofErr w:type="spellEnd"/>
+      <w:r>
+        <w:t>.</w:t>
+      </w:r>
+    </w:p>
+    <w:p>
+      <w:pPr>
+        <w:pStyle w:val="paragraph"/>
+      </w:pPr>
+      <w:r>
+        <w:t xml:space="preserve">Refer to the below screenshot to enter details while creating the spring boot application using the spring </w:t>
+      </w:r>
+      <w:proofErr w:type="spellStart"/>
+      <w:r>
+        <w:t>initializr</w:t>
+      </w:r>
+      <w:proofErr w:type="spellEnd"/>
+      <w:r>
+        <w:t>:</w:t>
+      </w:r>
+    </w:p>
+    <w:p>
+      <w:r>
+        <w:rPr>
+          <w:noProof/>
+        </w:rPr>
+        <w:drawing>
+          <wp:inline distT="0" distB="0" distL="0" distR="0" wp14:anchorId="06117E77" wp14:editId="62F58A35">
+            <wp:extent cx="5731510" cy="3289347"/>
+            <wp:effectExtent l="0" t="0" r="2540" b="6350"/>
+            <wp:docPr id="1" name="Picture 1"/>
+            <wp:cNvGraphicFramePr>
+              <a:graphicFrameLocks xmlns:a="http://schemas.openxmlformats.org/drawingml/2006/main" noChangeAspect="1"/>
+            </wp:cNvGraphicFramePr>
+            <a:graphic xmlns:a="http://schemas.openxmlformats.org/drawingml/2006/main">
+              <a:graphicData uri="http://schemas.openxmlformats.org/drawingml/2006/picture">
+                <pic:pic xmlns:pic="http://schemas.openxmlformats.org/drawingml/2006/picture">
+                  <pic:nvPicPr>
+                    <pic:cNvPr id="0" name="Picture 1"/>
+                    <pic:cNvPicPr>
+                      <a:picLocks noChangeAspect="1" noChangeArrowheads="1"/>
+                    </pic:cNvPicPr>
+                  </pic:nvPicPr>
+                  <pic:blipFill>
+                    <a:blip r:embed="rId8" cstate="print">
+                      <a:extLst>
+                        <a:ext uri="{28A0092B-C50C-407E-A947-70E740481C1C}">
+                          <a14:useLocalDpi xmlns:a14="http://schemas.microsoft.com/office/drawing/2010/main" val="0"/>
+                        </a:ext>
+                      </a:extLst>
+                    </a:blip>
+                    <a:srcRect/>
+                    <a:stretch>
+                      <a:fillRect/>
+                    </a:stretch>
+                  </pic:blipFill>
+                  <pic:spPr bwMode="auto">
+                    <a:xfrm>
+                      <a:off x="0" y="0"/>
+                      <a:ext cx="5731510" cy="3289347"/>
+                    </a:xfrm>
+                    <a:prstGeom prst="rect">
+                      <a:avLst/>
+                    </a:prstGeom>
+                    <a:noFill/>
+                    <a:ln>
+                      <a:noFill/>
+                    </a:ln>
+                  </pic:spPr>
+                </pic:pic>
+              </a:graphicData>
+            </a:graphic>
+          </wp:inline>
+        </w:drawing>
+      </w:r>
+    </w:p>
+    <w:p>
+      <w:pPr>
+        <w:pStyle w:val="paragraph"/>
+      </w:pPr>
+      <w:r>
+        <w:t>Here is the complete pom.xml file for your reference:</w:t>
+      </w:r>
+    </w:p>
+    <w:p>
+      <w:pPr>
+        <w:pStyle w:val="Code"/>
+      </w:pPr>
+      <w:r>
+        <w:t>&lt;?xml version="1.0" encoding="UTF-8"?&gt;</w:t>
+      </w:r>
+    </w:p>
+    <w:p>
+      <w:pPr>
+        <w:pStyle w:val="Code"/>
+      </w:pPr>
+      <w:r>
+        <w:t xml:space="preserve">&lt;project </w:t>
+      </w:r>
+      <w:proofErr w:type="spellStart"/>
+      <w:r>
+        <w:t>xmlns</w:t>
+      </w:r>
+      <w:proofErr w:type="spellEnd"/>
+      <w:r>
+        <w:t xml:space="preserve">="http://maven.apache.org/POM/4.0.0" </w:t>
+      </w:r>
+      <w:proofErr w:type="spellStart"/>
+      <w:proofErr w:type="gramStart"/>
+      <w:r>
+        <w:t>xmlns:xsi</w:t>
+      </w:r>
+      <w:proofErr w:type="spellEnd"/>
+      <w:proofErr w:type="gramEnd"/>
+      <w:r>
+        <w:t>="http://www.w3.org/2001/XMLSchema-instance"</w:t>
+      </w:r>
+    </w:p>
+    <w:p>
+      <w:pPr>
+        <w:pStyle w:val="Code"/>
+      </w:pPr>
+      <w:r>
+        <w:tab/>
+      </w:r>
+      <w:proofErr w:type="spellStart"/>
+      <w:proofErr w:type="gramStart"/>
+      <w:r>
+        <w:t>xsi:schemaLocation</w:t>
+      </w:r>
+      <w:proofErr w:type="spellEnd"/>
+      <w:proofErr w:type="gramEnd"/>
+      <w:r>
+        <w:t>="http://maven.apache.org/POM/4.0.0 https://maven.apache.org/xsd/maven-4.0.0.xsd"&gt;</w:t>
+      </w:r>
+    </w:p>
+    <w:p>
+      <w:pPr>
+        <w:pStyle w:val="Code"/>
+      </w:pPr>
+      <w:r>
+        <w:tab/>
+        <w:t>&lt;</w:t>
+      </w:r>
+      <w:proofErr w:type="spellStart"/>
+      <w:r>
+        <w:t>modelVersion</w:t>
+      </w:r>
+      <w:proofErr w:type="spellEnd"/>
+      <w:r>
+        <w:t>&gt;4.0.0&lt;/</w:t>
+      </w:r>
+      <w:proofErr w:type="spellStart"/>
+      <w:r>
+        <w:t>modelVersion</w:t>
+      </w:r>
+      <w:proofErr w:type="spellEnd"/>
+      <w:r>
+        <w:t>&gt;</w:t>
+      </w:r>
+    </w:p>
+    <w:p>
+      <w:pPr>
+        <w:pStyle w:val="Code"/>
+      </w:pPr>
+      <w:r>
+        <w:tab/>
+        <w:t>&lt;parent&gt;</w:t>
+      </w:r>
+    </w:p>
+    <w:p>
+      <w:pPr>
+        <w:pStyle w:val="Code"/>
+      </w:pPr>
+      <w:r>
+        <w:tab/>
+      </w:r>
+      <w:r>
+        <w:tab/>
+      </w:r>
+      <w:proofErr w:type="gramStart"/>
+      <w:r>
+        <w:t>&lt;</w:t>
+      </w:r>
+      <w:proofErr w:type="spellStart"/>
+      <w:r>
+        <w:t>groupId</w:t>
+      </w:r>
+      <w:proofErr w:type="spellEnd"/>
+      <w:r>
+        <w:t>&gt;</w:t>
+      </w:r>
+      <w:proofErr w:type="spellStart"/>
+      <w:r>
+        <w:t>org.springframework.boot</w:t>
+      </w:r>
+      <w:proofErr w:type="spellEnd"/>
+      <w:proofErr w:type="gramEnd"/>
+      <w:r>
+        <w:t>&lt;/</w:t>
+      </w:r>
+      <w:proofErr w:type="spellStart"/>
+      <w:r>
+        <w:t>groupId</w:t>
+      </w:r>
+      <w:proofErr w:type="spellEnd"/>
+      <w:r>
+        <w:t>&gt;</w:t>
+      </w:r>
+    </w:p>
+    <w:p>
+      <w:pPr>
+        <w:pStyle w:val="Code"/>
+      </w:pPr>
+      <w:r>
+        <w:tab/>
+      </w:r>
+      <w:r>
+        <w:tab/>
+        <w:t>&lt;</w:t>
+      </w:r>
+      <w:proofErr w:type="spellStart"/>
+      <w:r>
+        <w:t>artifactId</w:t>
+      </w:r>
+      <w:proofErr w:type="spellEnd"/>
+      <w:r>
+        <w:t>&gt;spring-boot-starter-parent&lt;/</w:t>
+      </w:r>
+      <w:proofErr w:type="spellStart"/>
+      <w:r>
+        <w:t>artifactId</w:t>
+      </w:r>
+      <w:proofErr w:type="spellEnd"/>
+      <w:r>
+        <w:t>&gt;</w:t>
+      </w:r>
+    </w:p>
+    <w:p>
+      <w:pPr>
+        <w:pStyle w:val="Code"/>
+      </w:pPr>
+      <w:r>
+        <w:tab/>
+      </w:r>
+      <w:r>
+        <w:tab/>
+        <w:t>&lt;version&gt;3.0.6&lt;/version&gt;</w:t>
+      </w:r>
+    </w:p>
+    <w:p>
+      <w:pPr>
+        <w:pStyle w:val="Code"/>
+      </w:pPr>
+      <w:r>
+        <w:tab/>
+      </w:r>
+      <w:r>
+        <w:tab/>
+        <w:t>&lt;</w:t>
+      </w:r>
+      <w:proofErr w:type="spellStart"/>
+      <w:r>
+        <w:t>relativePath</w:t>
+      </w:r>
+      <w:proofErr w:type="spellEnd"/>
+      <w:r>
+        <w:t xml:space="preserve">/&gt; </w:t>
+      </w:r>
+      <w:proofErr w:type="gramStart"/>
+      <w:r>
+        <w:t>&lt;!--</w:t>
+      </w:r>
+      <w:proofErr w:type="gramEnd"/>
+      <w:r>
+        <w:t xml:space="preserve"> lookup parent from repository --&gt;</w:t>
+      </w:r>
+    </w:p>
+    <w:p>
+      <w:pPr>
+        <w:pStyle w:val="Code"/>
+      </w:pPr>
+      <w:r>
+        <w:tab/>
+        <w:t>&lt;/parent&gt;</w:t>
+      </w:r>
+    </w:p>
+    <w:p>
+      <w:pPr>
+        <w:pStyle w:val="Code"/>
+      </w:pPr>
+      <w:r>
+        <w:tab/>
+        <w:t>&lt;</w:t>
+      </w:r>
+      <w:proofErr w:type="spellStart"/>
+      <w:r>
+        <w:t>groupId</w:t>
+      </w:r>
+      <w:proofErr w:type="spellEnd"/>
+      <w:r>
+        <w:t>&gt;</w:t>
+      </w:r>
+      <w:proofErr w:type="spellStart"/>
+      <w:r>
+        <w:t>net.javaguides</w:t>
+      </w:r>
+      <w:proofErr w:type="spellEnd"/>
+      <w:r>
+        <w:t>&lt;/</w:t>
+      </w:r>
+      <w:proofErr w:type="spellStart"/>
+      <w:r>
+        <w:t>groupId</w:t>
+      </w:r>
+      <w:proofErr w:type="spellEnd"/>
+      <w:r>
+        <w:t>&gt;</w:t>
+      </w:r>
+    </w:p>
+    <w:p>
+      <w:pPr>
+        <w:pStyle w:val="Code"/>
+      </w:pPr>
+      <w:r>
+        <w:tab/>
+        <w:t>&lt;</w:t>
+      </w:r>
+      <w:proofErr w:type="spellStart"/>
+      <w:r>
+        <w:t>artifactId</w:t>
+      </w:r>
+      <w:proofErr w:type="spellEnd"/>
+      <w:r>
+        <w:t>&gt;school&lt;/</w:t>
+      </w:r>
+      <w:proofErr w:type="spellStart"/>
+      <w:r>
+        <w:t>artifactId</w:t>
+      </w:r>
+      <w:proofErr w:type="spellEnd"/>
+      <w:r>
+        <w:t>&gt;</w:t>
+      </w:r>
+    </w:p>
+    <w:p>
+      <w:pPr>
+        <w:pStyle w:val="Code"/>
+      </w:pPr>
+      <w:r>
+        <w:tab/>
+        <w:t>&lt;version&gt;0.0.1-SNAPSHOT&lt;/version&gt;</w:t>
+      </w:r>
+    </w:p>
+    <w:p>
+      <w:pPr>
+        <w:pStyle w:val="Code"/>
+      </w:pPr>
+      <w:r>
+        <w:tab/>
+        <w:t>&lt;name&gt;school&lt;/name&gt;</w:t>
+      </w:r>
+    </w:p>
+    <w:p>
+      <w:pPr>
+        <w:pStyle w:val="Code"/>
+      </w:pPr>
+      <w:r>
+        <w:tab/>
+        <w:t>&lt;description&gt;Demo project for Spring Boot&lt;/description&gt;</w:t>
+      </w:r>
+    </w:p>
+    <w:p>
+      <w:pPr>
+        <w:pStyle w:val="Code"/>
+      </w:pPr>
+      <w:r>
+        <w:tab/>
+        <w:t>&lt;properties&gt;</w:t>
+      </w:r>
+    </w:p>
+    <w:p>
+      <w:pPr>
+        <w:pStyle w:val="Code"/>
+      </w:pPr>
+      <w:r>
+        <w:lastRenderedPageBreak/>
+        <w:tab/>
+      </w:r>
+      <w:r>
+        <w:tab/>
+        <w:t>&lt;</w:t>
+      </w:r>
+      <w:proofErr w:type="spellStart"/>
+      <w:proofErr w:type="gramStart"/>
+      <w:r>
+        <w:t>java.version</w:t>
+      </w:r>
+      <w:proofErr w:type="spellEnd"/>
+      <w:proofErr w:type="gramEnd"/>
+      <w:r>
+        <w:t>&gt;17&lt;/</w:t>
+      </w:r>
+      <w:proofErr w:type="spellStart"/>
+      <w:proofErr w:type="gramStart"/>
+      <w:r>
+        <w:t>java.version</w:t>
+      </w:r>
+      <w:proofErr w:type="spellEnd"/>
+      <w:proofErr w:type="gramEnd"/>
+      <w:r>
+        <w:t>&gt;</w:t>
+      </w:r>
+    </w:p>
+    <w:p>
+      <w:pPr>
+        <w:pStyle w:val="Code"/>
+      </w:pPr>
+      <w:r>
+        <w:tab/>
+        <w:t>&lt;/properties&gt;</w:t>
+      </w:r>
+    </w:p>
+    <w:p>
+      <w:pPr>
+        <w:pStyle w:val="Code"/>
+      </w:pPr>
+      <w:r>
+        <w:tab/>
+        <w:t>&lt;dependencies&gt;</w:t>
+      </w:r>
+    </w:p>
+    <w:p>
+      <w:pPr>
+        <w:pStyle w:val="Code"/>
+      </w:pPr>
+      <w:r>
+        <w:tab/>
+      </w:r>
+      <w:r>
+        <w:tab/>
+        <w:t>&lt;dependency&gt;</w:t>
+      </w:r>
+    </w:p>
+    <w:p>
+      <w:pPr>
+        <w:pStyle w:val="Code"/>
+      </w:pPr>
+      <w:r>
+        <w:tab/>
+      </w:r>
+      <w:r>
+        <w:tab/>
+      </w:r>
+      <w:r>
+        <w:tab/>
+      </w:r>
+      <w:proofErr w:type="gramStart"/>
+      <w:r>
+        <w:t>&lt;</w:t>
+      </w:r>
+      <w:proofErr w:type="spellStart"/>
+      <w:r>
+        <w:t>groupId</w:t>
+      </w:r>
+      <w:proofErr w:type="spellEnd"/>
+      <w:r>
+        <w:t>&gt;</w:t>
+      </w:r>
+      <w:proofErr w:type="spellStart"/>
+      <w:r>
+        <w:t>org.springframework.boot</w:t>
+      </w:r>
+      <w:proofErr w:type="spellEnd"/>
+      <w:proofErr w:type="gramEnd"/>
+      <w:r>
+        <w:t>&lt;/</w:t>
+      </w:r>
+      <w:proofErr w:type="spellStart"/>
+      <w:r>
+        <w:t>groupId</w:t>
+      </w:r>
+      <w:proofErr w:type="spellEnd"/>
+      <w:r>
+        <w:t>&gt;</w:t>
+      </w:r>
+    </w:p>
+    <w:p>
+      <w:pPr>
+        <w:pStyle w:val="Code"/>
+      </w:pPr>
+      <w:r>
+        <w:tab/>
+      </w:r>
+      <w:r>
+        <w:tab/>
+      </w:r>
+      <w:r>
+        <w:tab/>
+        <w:t>&lt;</w:t>
+      </w:r>
+      <w:proofErr w:type="spellStart"/>
+      <w:r>
+        <w:t>artifactId</w:t>
+      </w:r>
+      <w:proofErr w:type="spellEnd"/>
+      <w:r>
+        <w:t>&gt;spring-boot-starter-actuator&lt;/</w:t>
+      </w:r>
+      <w:proofErr w:type="spellStart"/>
+      <w:r>
+        <w:t>artifactId</w:t>
+      </w:r>
+      <w:proofErr w:type="spellEnd"/>
+      <w:r>
+        <w:t>&gt;</w:t>
+      </w:r>
+    </w:p>
+    <w:p>
+      <w:pPr>
+        <w:pStyle w:val="Code"/>
+      </w:pPr>
+      <w:r>
+        <w:tab/>
+      </w:r>
+      <w:r>
+        <w:tab/>
+        <w:t>&lt;/dependency&gt;</w:t>
+      </w:r>
+    </w:p>
+    <w:p>
+      <w:pPr>
+        <w:pStyle w:val="Code"/>
+      </w:pPr>
+      <w:r>
+        <w:tab/>
+      </w:r>
+      <w:r>
+        <w:tab/>
+        <w:t>&lt;dependency&gt;</w:t>
+      </w:r>
+    </w:p>
+    <w:p>
+      <w:pPr>
+        <w:pStyle w:val="Code"/>
+      </w:pPr>
+      <w:r>
+        <w:tab/>
+      </w:r>
+      <w:r>
+        <w:tab/>
+      </w:r>
+      <w:r>
+        <w:tab/>
+      </w:r>
+      <w:proofErr w:type="gramStart"/>
+      <w:r>
+        <w:t>&lt;</w:t>
+      </w:r>
+      <w:proofErr w:type="spellStart"/>
+      <w:r>
+        <w:t>groupId</w:t>
+      </w:r>
+      <w:proofErr w:type="spellEnd"/>
+      <w:r>
+        <w:t>&gt;</w:t>
+      </w:r>
+      <w:proofErr w:type="spellStart"/>
+      <w:r>
+        <w:t>org.springframework.boot</w:t>
+      </w:r>
+      <w:proofErr w:type="spellEnd"/>
+      <w:proofErr w:type="gramEnd"/>
+      <w:r>
+        <w:t>&lt;/</w:t>
+      </w:r>
+      <w:proofErr w:type="spellStart"/>
+      <w:r>
+        <w:t>groupId</w:t>
+      </w:r>
+      <w:proofErr w:type="spellEnd"/>
+      <w:r>
+        <w:t>&gt;</w:t>
+      </w:r>
+    </w:p>
+    <w:p>
+      <w:pPr>
+        <w:pStyle w:val="Code"/>
+      </w:pPr>
+      <w:r>
+        <w:tab/>
+      </w:r>
+      <w:r>
+        <w:tab/>
+      </w:r>
+      <w:r>
+        <w:tab/>
+        <w:t>&lt;</w:t>
+      </w:r>
+      <w:proofErr w:type="spellStart"/>
+      <w:r>
+        <w:t>artifactId</w:t>
+      </w:r>
+      <w:proofErr w:type="spellEnd"/>
+      <w:r>
+        <w:t>&gt;spring-boot-starter-data-</w:t>
+      </w:r>
+      <w:proofErr w:type="spellStart"/>
+      <w:r>
+        <w:t>jpa</w:t>
+      </w:r>
+      <w:proofErr w:type="spellEnd"/>
+      <w:r>
+        <w:t>&lt;/</w:t>
+      </w:r>
+      <w:proofErr w:type="spellStart"/>
+      <w:r>
+        <w:t>artifactId</w:t>
+      </w:r>
+      <w:proofErr w:type="spellEnd"/>
+      <w:r>
+        <w:t>&gt;</w:t>
+      </w:r>
+    </w:p>
+    <w:p>
+      <w:pPr>
+        <w:pStyle w:val="Code"/>
+      </w:pPr>
+      <w:r>
+        <w:tab/>
+      </w:r>
+      <w:r>
+        <w:tab/>
+        <w:t>&lt;/dependency&gt;</w:t>
+      </w:r>
+    </w:p>
+    <w:p>
+      <w:pPr>
+        <w:pStyle w:val="Code"/>
+      </w:pPr>
+      <w:r>
+        <w:tab/>
+      </w:r>
+      <w:r>
+        <w:tab/>
+        <w:t>&lt;dependency&gt;</w:t>
+      </w:r>
+    </w:p>
+    <w:p>
+      <w:pPr>
+        <w:pStyle w:val="Code"/>
+      </w:pPr>
+      <w:r>
+        <w:tab/>
+      </w:r>
+      <w:r>
+        <w:tab/>
+      </w:r>
+      <w:r>
+        <w:tab/>
+      </w:r>
+      <w:proofErr w:type="gramStart"/>
+      <w:r>
+        <w:t>&lt;</w:t>
+      </w:r>
+      <w:proofErr w:type="spellStart"/>
+      <w:r>
+        <w:t>groupId</w:t>
+      </w:r>
+      <w:proofErr w:type="spellEnd"/>
+      <w:r>
+        <w:t>&gt;</w:t>
+      </w:r>
+      <w:proofErr w:type="spellStart"/>
+      <w:r>
+        <w:t>org.springframework.boot</w:t>
+      </w:r>
+      <w:proofErr w:type="spellEnd"/>
+      <w:proofErr w:type="gramEnd"/>
+      <w:r>
+        <w:t>&lt;/</w:t>
+      </w:r>
+      <w:proofErr w:type="spellStart"/>
+      <w:r>
+        <w:t>groupId</w:t>
+      </w:r>
+      <w:proofErr w:type="spellEnd"/>
+      <w:r>
+        <w:t>&gt;</w:t>
+      </w:r>
+    </w:p>
+    <w:p>
+      <w:pPr>
+        <w:pStyle w:val="Code"/>
+      </w:pPr>
+      <w:r>
+        <w:tab/>
+      </w:r>
+      <w:r>
+        <w:tab/>
+      </w:r>
+      <w:r>
+        <w:tab/>
+        <w:t>&lt;</w:t>
+      </w:r>
+      <w:proofErr w:type="spellStart"/>
+      <w:r>
+        <w:t>artifactId</w:t>
+      </w:r>
+      <w:proofErr w:type="spellEnd"/>
+      <w:r>
+        <w:t>&gt;spring-boot-starter-web&lt;/</w:t>
+      </w:r>
+      <w:proofErr w:type="spellStart"/>
+      <w:r>
+        <w:t>artifactId</w:t>
+      </w:r>
+      <w:proofErr w:type="spellEnd"/>
+      <w:r>
+        <w:t>&gt;</w:t>
+      </w:r>
+    </w:p>
+    <w:p>
+      <w:pPr>
+        <w:pStyle w:val="Code"/>
+      </w:pPr>
+      <w:r>
+        <w:tab/>
+      </w:r>
+      <w:r>
+        <w:tab/>
+        <w:t>&lt;/dependency&gt;</w:t>
+      </w:r>
+    </w:p>
+    <w:p>
+      <w:pPr>
+        <w:pStyle w:val="Code"/>
+      </w:pPr>
+    </w:p>
+    <w:p>
+      <w:pPr>
+        <w:pStyle w:val="Code"/>
+      </w:pPr>
+      <w:r>
+        <w:tab/>
+      </w:r>
+      <w:r>
+        <w:tab/>
+        <w:t>&lt;dependency&gt;</w:t>
+      </w:r>
+    </w:p>
+    <w:p>
+      <w:pPr>
+        <w:pStyle w:val="Code"/>
+      </w:pPr>
+      <w:r>
+        <w:tab/>
+      </w:r>
+      <w:r>
+        <w:tab/>
+      </w:r>
+      <w:r>
+        <w:tab/>
+        <w:t>&lt;</w:t>
+      </w:r>
+      <w:proofErr w:type="spellStart"/>
+      <w:r>
+        <w:t>groupId</w:t>
+      </w:r>
+      <w:proofErr w:type="spellEnd"/>
+      <w:r>
+        <w:t>&gt;</w:t>
+      </w:r>
+      <w:proofErr w:type="spellStart"/>
+      <w:r>
+        <w:t>org.postgresql</w:t>
+      </w:r>
+      <w:proofErr w:type="spellEnd"/>
+      <w:r>
+        <w:t>&lt;/</w:t>
+      </w:r>
+      <w:proofErr w:type="spellStart"/>
+      <w:r>
+        <w:t>groupId</w:t>
+      </w:r>
+      <w:proofErr w:type="spellEnd"/>
+      <w:r>
+        <w:t>&gt;</w:t>
+      </w:r>
+    </w:p>
+    <w:p>
+      <w:pPr>
+        <w:pStyle w:val="Code"/>
+      </w:pPr>
+      <w:r>
+        <w:tab/>
+      </w:r>
+      <w:r>
+        <w:tab/>
+      </w:r>
+      <w:r>
+        <w:tab/>
+        <w:t>&lt;</w:t>
+      </w:r>
+      <w:proofErr w:type="spellStart"/>
+      <w:r>
+        <w:t>artifactId</w:t>
+      </w:r>
+      <w:proofErr w:type="spellEnd"/>
+      <w:r>
+        <w:t>&gt;</w:t>
+      </w:r>
+      <w:proofErr w:type="spellStart"/>
+      <w:r>
+        <w:t>postgresql</w:t>
+      </w:r>
+      <w:proofErr w:type="spellEnd"/>
+      <w:r>
+        <w:t>&lt;/</w:t>
+      </w:r>
+      <w:proofErr w:type="spellStart"/>
+      <w:r>
+        <w:t>artifactId</w:t>
+      </w:r>
+      <w:proofErr w:type="spellEnd"/>
+      <w:r>
+        <w:t>&gt;</w:t>
+      </w:r>
+    </w:p>
+    <w:p>
+      <w:pPr>
+        <w:pStyle w:val="Code"/>
+      </w:pPr>
+      <w:r>
+        <w:tab/>
+      </w:r>
+      <w:r>
+        <w:tab/>
+      </w:r>
+      <w:r>
+        <w:tab/>
+        <w:t>&lt;scope&gt;runtime&lt;/scope&gt;</w:t>
+      </w:r>
+    </w:p>
+    <w:p>
+      <w:pPr>
+        <w:pStyle w:val="Code"/>
+      </w:pPr>
+      <w:r>
+        <w:tab/>
+      </w:r>
+      <w:r>
+        <w:tab/>
+        <w:t>&lt;/dependency&gt;</w:t>
+      </w:r>
+    </w:p>
+    <w:p>
+      <w:pPr>
+        <w:pStyle w:val="Code"/>
+      </w:pPr>
+      <w:r>
+        <w:tab/>
+      </w:r>
+      <w:r>
+        <w:tab/>
+        <w:t>&lt;dependency&gt;</w:t>
+      </w:r>
+    </w:p>
+    <w:p>
+      <w:pPr>
+        <w:pStyle w:val="Code"/>
+      </w:pPr>
+      <w:r>
+        <w:tab/>
+      </w:r>
+      <w:r>
+        <w:tab/>
+      </w:r>
+      <w:r>
+        <w:tab/>
+        <w:t>&lt;</w:t>
+      </w:r>
+      <w:proofErr w:type="spellStart"/>
+      <w:r>
+        <w:t>groupId</w:t>
+      </w:r>
+      <w:proofErr w:type="spellEnd"/>
+      <w:r>
+        <w:t>&gt;</w:t>
+      </w:r>
+      <w:proofErr w:type="spellStart"/>
+      <w:r>
+        <w:t>org.projectlombok</w:t>
+      </w:r>
+      <w:proofErr w:type="spellEnd"/>
+      <w:r>
+        <w:t>&lt;/</w:t>
+      </w:r>
+      <w:proofErr w:type="spellStart"/>
+      <w:r>
+        <w:t>groupId</w:t>
+      </w:r>
+      <w:proofErr w:type="spellEnd"/>
+      <w:r>
+        <w:t>&gt;</w:t>
+      </w:r>
+    </w:p>
+    <w:p>
+      <w:pPr>
+        <w:pStyle w:val="Code"/>
+      </w:pPr>
+      <w:r>
+        <w:tab/>
+      </w:r>
+      <w:r>
+        <w:tab/>
+      </w:r>
+      <w:r>
+        <w:tab/>
+        <w:t>&lt;</w:t>
+      </w:r>
+      <w:proofErr w:type="spellStart"/>
+      <w:r>
+        <w:t>artifactId</w:t>
+      </w:r>
+      <w:proofErr w:type="spellEnd"/>
+      <w:r>
+        <w:t>&gt;</w:t>
+      </w:r>
+      <w:proofErr w:type="spellStart"/>
+      <w:r>
+        <w:t>lombok</w:t>
+      </w:r>
+      <w:proofErr w:type="spellEnd"/>
+      <w:r>
+        <w:t>&lt;/</w:t>
+      </w:r>
+      <w:proofErr w:type="spellStart"/>
+      <w:r>
+        <w:t>artifactId</w:t>
+      </w:r>
+      <w:proofErr w:type="spellEnd"/>
+      <w:r>
+        <w:t>&gt;</w:t>
+      </w:r>
+    </w:p>
+    <w:p>
+      <w:pPr>
+        <w:pStyle w:val="Code"/>
+      </w:pPr>
+      <w:r>
+        <w:tab/>
+      </w:r>
+      <w:r>
+        <w:tab/>
+      </w:r>
+      <w:r>
+        <w:tab/>
+        <w:t>&lt;optional&gt;true&lt;/optional&gt;</w:t>
+      </w:r>
+    </w:p>
+    <w:p>
+      <w:pPr>
+        <w:pStyle w:val="Code"/>
+      </w:pPr>
+      <w:r>
+        <w:tab/>
+      </w:r>
+      <w:r>
+        <w:tab/>
+        <w:t>&lt;/dependency&gt;</w:t>
+      </w:r>
+    </w:p>
+    <w:p>
+      <w:pPr>
+        <w:pStyle w:val="Code"/>
+      </w:pPr>
+      <w:r>
+        <w:tab/>
+      </w:r>
+      <w:r>
+        <w:tab/>
+        <w:t>&lt;dependency&gt;</w:t>
+      </w:r>
+    </w:p>
+    <w:p>
+      <w:pPr>
+        <w:pStyle w:val="Code"/>
+      </w:pPr>
+      <w:r>
+        <w:tab/>
+      </w:r>
+      <w:r>
+        <w:tab/>
+      </w:r>
+      <w:r>
+        <w:tab/>
+      </w:r>
+      <w:proofErr w:type="gramStart"/>
+      <w:r>
+        <w:t>&lt;</w:t>
+      </w:r>
+      <w:proofErr w:type="spellStart"/>
+      <w:r>
+        <w:t>groupId</w:t>
+      </w:r>
+      <w:proofErr w:type="spellEnd"/>
+      <w:r>
+        <w:t>&gt;</w:t>
+      </w:r>
+      <w:proofErr w:type="spellStart"/>
+      <w:r>
+        <w:t>org.springframework.boot</w:t>
+      </w:r>
+      <w:proofErr w:type="spellEnd"/>
+      <w:proofErr w:type="gramEnd"/>
+      <w:r>
+        <w:t>&lt;/</w:t>
+      </w:r>
+      <w:proofErr w:type="spellStart"/>
+      <w:r>
+        <w:t>groupId</w:t>
+      </w:r>
+      <w:proofErr w:type="spellEnd"/>
+      <w:r>
+        <w:t>&gt;</w:t>
+      </w:r>
+    </w:p>
+    <w:p>
+      <w:pPr>
+        <w:pStyle w:val="Code"/>
+      </w:pPr>
+      <w:r>
+        <w:tab/>
+      </w:r>
+      <w:r>
+        <w:tab/>
+      </w:r>
+      <w:r>
+        <w:tab/>
+        <w:t>&lt;</w:t>
+      </w:r>
+      <w:proofErr w:type="spellStart"/>
+      <w:r>
+        <w:t>artifactId</w:t>
+      </w:r>
+      <w:proofErr w:type="spellEnd"/>
+      <w:r>
+        <w:t>&gt;spring-boot-starter-test&lt;/</w:t>
+      </w:r>
+      <w:proofErr w:type="spellStart"/>
+      <w:r>
+        <w:t>artifactId</w:t>
+      </w:r>
+      <w:proofErr w:type="spellEnd"/>
+      <w:r>
+        <w:t>&gt;</w:t>
+      </w:r>
+    </w:p>
+    <w:p>
+      <w:pPr>
+        <w:pStyle w:val="Code"/>
+      </w:pPr>
+      <w:r>
+        <w:tab/>
+      </w:r>
+      <w:r>
+        <w:tab/>
+      </w:r>
+      <w:r>
+        <w:tab/>
+        <w:t>&lt;scope&gt;test&lt;/scope&gt;</w:t>
+      </w:r>
+    </w:p>
+    <w:p>
+      <w:pPr>
+        <w:pStyle w:val="Code"/>
+      </w:pPr>
+      <w:r>
+        <w:tab/>
+      </w:r>
+      <w:r>
+        <w:tab/>
+        <w:t>&lt;/dependency&gt;</w:t>
+      </w:r>
+    </w:p>
+    <w:p>
+      <w:pPr>
+        <w:pStyle w:val="Code"/>
+      </w:pPr>
+      <w:r>
+        <w:tab/>
+        <w:t>&lt;/dependencies&gt;</w:t>
+      </w:r>
+    </w:p>
+    <w:p>
+      <w:pPr>
+        <w:pStyle w:val="Code"/>
+      </w:pPr>
+    </w:p>
+    <w:p>
+      <w:pPr>
+        <w:pStyle w:val="Code"/>
+      </w:pPr>
+      <w:r>
+        <w:tab/>
+        <w:t>&lt;build&gt;</w:t>
+      </w:r>
+    </w:p>
+    <w:p>
+      <w:pPr>
+        <w:pStyle w:val="Code"/>
+      </w:pPr>
+      <w:r>
+        <w:tab/>
+      </w:r>
+      <w:r>
+        <w:tab/>
+        <w:t>&lt;plugins&gt;</w:t>
+      </w:r>
+    </w:p>
+    <w:p>
+      <w:pPr>
+        <w:pStyle w:val="Code"/>
+      </w:pPr>
+      <w:r>
+        <w:tab/>
+      </w:r>
+      <w:r>
+        <w:tab/>
+      </w:r>
+      <w:r>
+        <w:tab/>
+        <w:t>&lt;plugin&gt;</w:t>
+      </w:r>
+    </w:p>
+    <w:p>
+      <w:pPr>
+        <w:pStyle w:val="Code"/>
+      </w:pPr>
+      <w:r>
+        <w:tab/>
+      </w:r>
+      <w:r>
+        <w:tab/>
+      </w:r>
+      <w:r>
+        <w:tab/>
+      </w:r>
+      <w:r>
+        <w:tab/>
+      </w:r>
+      <w:proofErr w:type="gramStart"/>
+      <w:r>
+        <w:t>&lt;</w:t>
+      </w:r>
+      <w:proofErr w:type="spellStart"/>
+      <w:r>
+        <w:t>groupId</w:t>
+      </w:r>
+      <w:proofErr w:type="spellEnd"/>
+      <w:r>
+        <w:t>&gt;</w:t>
+      </w:r>
+      <w:proofErr w:type="spellStart"/>
+      <w:r>
+        <w:t>org.springframework.boot</w:t>
+      </w:r>
+      <w:proofErr w:type="spellEnd"/>
+      <w:proofErr w:type="gramEnd"/>
+      <w:r>
+        <w:t>&lt;/</w:t>
+      </w:r>
+      <w:proofErr w:type="spellStart"/>
+      <w:r>
+        <w:t>groupId</w:t>
+      </w:r>
+      <w:proofErr w:type="spellEnd"/>
+      <w:r>
+        <w:t>&gt;</w:t>
+      </w:r>
+    </w:p>
+    <w:p>
+      <w:pPr>
+        <w:pStyle w:val="Code"/>
+      </w:pPr>
+      <w:r>
+        <w:tab/>
+      </w:r>
+      <w:r>
+        <w:tab/>
+      </w:r>
+      <w:r>
+        <w:tab/>
+      </w:r>
+      <w:r>
+        <w:tab/>
+        <w:t>&lt;</w:t>
+      </w:r>
+      <w:proofErr w:type="spellStart"/>
+      <w:r>
+        <w:t>artifactId</w:t>
+      </w:r>
+      <w:proofErr w:type="spellEnd"/>
+      <w:r>
+        <w:t>&gt;spring-boot-maven-plugin&lt;/</w:t>
+      </w:r>
+      <w:proofErr w:type="spellStart"/>
+      <w:r>
+        <w:t>artifactId</w:t>
+      </w:r>
+      <w:proofErr w:type="spellEnd"/>
+      <w:r>
+        <w:t>&gt;</w:t>
+      </w:r>
+    </w:p>
+    <w:p>
+      <w:pPr>
+        <w:pStyle w:val="Code"/>
+      </w:pPr>
+      <w:r>
+        <w:tab/>
+      </w:r>
+      <w:r>
+        <w:tab/>
+      </w:r>
+      <w:r>
+        <w:tab/>
+      </w:r>
+      <w:r>
+        <w:tab/>
+        <w:t>&lt;configuration&gt;</w:t>
+      </w:r>
+    </w:p>
+    <w:p>
+      <w:pPr>
+        <w:pStyle w:val="Code"/>
+      </w:pPr>
+      <w:r>
+        <w:tab/>
+      </w:r>
+      <w:r>
+        <w:tab/>
+      </w:r>
+      <w:r>
+        <w:tab/>
+      </w:r>
+      <w:r>
+        <w:tab/>
+      </w:r>
+      <w:r>
+        <w:tab/>
+        <w:t>&lt;excludes&gt;</w:t>
+      </w:r>
+    </w:p>
+    <w:p>
+      <w:pPr>
+        <w:pStyle w:val="Code"/>
+      </w:pPr>
+      <w:r>
+        <w:tab/>
+      </w:r>
+      <w:r>
+        <w:tab/>
+      </w:r>
+      <w:r>
+        <w:tab/>
+      </w:r>
+      <w:r>
+        <w:tab/>
+      </w:r>
+      <w:r>
+        <w:tab/>
+      </w:r>
+      <w:r>
+        <w:tab/>
+        <w:t>&lt;exclude&gt;</w:t>
+      </w:r>
+    </w:p>
+    <w:p>
+      <w:pPr>
+        <w:pStyle w:val="Code"/>
+      </w:pPr>
+      <w:r>
+        <w:tab/>
+      </w:r>
+      <w:r>
+        <w:tab/>
+      </w:r>
+      <w:r>
+        <w:tab/>
+      </w:r>
+      <w:r>
+        <w:tab/>
+      </w:r>
+      <w:r>
+        <w:tab/>
+      </w:r>
+      <w:r>
+        <w:tab/>
+      </w:r>
+      <w:r>
+        <w:tab/>
+        <w:t>&lt;</w:t>
+      </w:r>
+      <w:proofErr w:type="spellStart"/>
+      <w:r>
+        <w:t>groupId</w:t>
+      </w:r>
+      <w:proofErr w:type="spellEnd"/>
+      <w:r>
+        <w:t>&gt;</w:t>
+      </w:r>
+      <w:proofErr w:type="spellStart"/>
+      <w:r>
+        <w:t>org.projectlombok</w:t>
+      </w:r>
+      <w:proofErr w:type="spellEnd"/>
+      <w:r>
+        <w:t>&lt;/</w:t>
+      </w:r>
+      <w:proofErr w:type="spellStart"/>
+      <w:r>
+        <w:t>groupId</w:t>
+      </w:r>
+      <w:proofErr w:type="spellEnd"/>
+      <w:r>
+        <w:t>&gt;</w:t>
+      </w:r>
+    </w:p>
+    <w:p>
+      <w:pPr>
+        <w:pStyle w:val="Code"/>
+      </w:pPr>
+      <w:r>
+        <w:tab/>
+      </w:r>
+      <w:r>
+        <w:tab/>
+      </w:r>
+      <w:r>
+        <w:tab/>
+      </w:r>
+      <w:r>
+        <w:tab/>
+      </w:r>
+      <w:r>
+        <w:tab/>
+      </w:r>
+      <w:r>
+        <w:tab/>
+      </w:r>
+      <w:r>
+        <w:tab/>
+        <w:t>&lt;</w:t>
+      </w:r>
+      <w:proofErr w:type="spellStart"/>
+      <w:r>
+        <w:t>artifactId</w:t>
+      </w:r>
+      <w:proofErr w:type="spellEnd"/>
+      <w:r>
+        <w:t>&gt;</w:t>
+      </w:r>
+      <w:proofErr w:type="spellStart"/>
+      <w:r>
+        <w:t>lombok</w:t>
+      </w:r>
+      <w:proofErr w:type="spellEnd"/>
+      <w:r>
+        <w:t>&lt;/</w:t>
+      </w:r>
+      <w:proofErr w:type="spellStart"/>
+      <w:r>
+        <w:t>artifactId</w:t>
+      </w:r>
+      <w:proofErr w:type="spellEnd"/>
+      <w:r>
+        <w:t>&gt;</w:t>
+      </w:r>
+    </w:p>
+    <w:p>
+      <w:pPr>
+        <w:pStyle w:val="Code"/>
+      </w:pPr>
+      <w:r>
+        <w:tab/>
+      </w:r>
+      <w:r>
+        <w:tab/>
+      </w:r>
+      <w:r>
+        <w:tab/>
+      </w:r>
+      <w:r>
+        <w:tab/>
+      </w:r>
+      <w:r>
+        <w:tab/>
+      </w:r>
+      <w:r>
+        <w:tab/>
+        <w:t>&lt;/exclude&gt;</w:t>
+      </w:r>
+    </w:p>
+    <w:p>
+      <w:pPr>
+        <w:pStyle w:val="Code"/>
+      </w:pPr>
+      <w:r>
+        <w:tab/>
+      </w:r>
+      <w:r>
+        <w:tab/>
+      </w:r>
+      <w:r>
+        <w:tab/>
+      </w:r>
+      <w:r>
+        <w:tab/>
+      </w:r>
+      <w:r>
+        <w:tab/>
+        <w:t>&lt;/excludes&gt;</w:t>
+      </w:r>
+    </w:p>
+    <w:p>
+      <w:pPr>
+        <w:pStyle w:val="Code"/>
+      </w:pPr>
+      <w:r>
+        <w:tab/>
+      </w:r>
+      <w:r>
+        <w:tab/>
+      </w:r>
+      <w:r>
+        <w:tab/>
+      </w:r>
+      <w:r>
+        <w:tab/>
+        <w:t>&lt;/configuration&gt;</w:t>
+      </w:r>
+    </w:p>
+    <w:p>
+      <w:pPr>
+        <w:pStyle w:val="Code"/>
+      </w:pPr>
+      <w:r>
+        <w:tab/>
+      </w:r>
+      <w:r>
+        <w:tab/>
+      </w:r>
+      <w:r>
+        <w:tab/>
+        <w:t>&lt;/plugin&gt;</w:t>
+      </w:r>
+    </w:p>
+    <w:p>
+      <w:pPr>
+        <w:pStyle w:val="Code"/>
+      </w:pPr>
+      <w:r>
+        <w:tab/>
+      </w:r>
+      <w:r>
+        <w:tab/>
+        <w:t>&lt;/plugins&gt;</w:t>
+      </w:r>
+    </w:p>
+    <w:p>
+      <w:pPr>
+        <w:pStyle w:val="Code"/>
+      </w:pPr>
+      <w:r>
+        <w:tab/>
+        <w:t>&lt;/build&gt;</w:t>
+      </w:r>
+    </w:p>
+    <w:p>
+      <w:pPr>
+        <w:pStyle w:val="Code"/>
+      </w:pPr>
+    </w:p>
+    <w:p>
+      <w:pPr>
+        <w:pStyle w:val="Code"/>
+      </w:pPr>
+      <w:r>
+        <w:t>&lt;/project&gt;</w:t>
+      </w:r>
+    </w:p>
+    <w:p>
+      <w:pPr>
+        <w:pStyle w:val="paragraph"/>
+      </w:pPr>
+      <w:r>
+        <w:t>Configure PostgreSQL Database</w:t>
+      </w:r>
+    </w:p>
+    <w:p>
+      <w:pPr>
+        <w:pStyle w:val="paragraph"/>
+      </w:pPr>
+      <w:r>
+        <w:lastRenderedPageBreak/>
+        <w:t xml:space="preserve">Create an </w:t>
+      </w:r>
+      <w:proofErr w:type="spellStart"/>
+      <w:r>
+        <w:t>application.yml</w:t>
+      </w:r>
+      <w:proofErr w:type="spellEnd"/>
+      <w:r>
+        <w:t xml:space="preserve"> file under /resources folder and add the following content:</w:t>
+      </w:r>
+    </w:p>
+    <w:p>
+      <w:pPr>
+        <w:pStyle w:val="Code"/>
+      </w:pPr>
+      <w:r>
+        <w:t>server:</w:t>
+      </w:r>
+    </w:p>
+    <w:p>
+      <w:pPr>
+        <w:pStyle w:val="Code"/>
+      </w:pPr>
+      <w:r>
+        <w:t xml:space="preserve">  port: 8090</w:t>
+      </w:r>
+    </w:p>
+    <w:p>
+      <w:pPr>
+        <w:pStyle w:val="Code"/>
+      </w:pPr>
+      <w:r>
+        <w:t>spring:</w:t>
+      </w:r>
+    </w:p>
+    <w:p>
+      <w:pPr>
+        <w:pStyle w:val="Code"/>
+      </w:pPr>
+      <w:r>
+        <w:t xml:space="preserve">  application:</w:t>
+      </w:r>
+    </w:p>
+    <w:p>
+      <w:pPr>
+        <w:pStyle w:val="Code"/>
+      </w:pPr>
+      <w:r>
+        <w:t xml:space="preserve">    name: schools</w:t>
+      </w:r>
+    </w:p>
+    <w:p>
+      <w:pPr>
+        <w:pStyle w:val="Code"/>
+      </w:pPr>
+      <w:r>
+        <w:t xml:space="preserve">  </w:t>
+      </w:r>
+      <w:proofErr w:type="spellStart"/>
+      <w:r>
+        <w:t>datasource</w:t>
+      </w:r>
+      <w:proofErr w:type="spellEnd"/>
+      <w:r>
+        <w:t>:</w:t>
+      </w:r>
+    </w:p>
+    <w:p>
+      <w:pPr>
+        <w:pStyle w:val="Code"/>
+      </w:pPr>
+      <w:r>
+        <w:t xml:space="preserve">    driver-class-name: </w:t>
+      </w:r>
+      <w:proofErr w:type="spellStart"/>
+      <w:proofErr w:type="gramStart"/>
+      <w:r>
+        <w:t>org.postgresql</w:t>
+      </w:r>
+      <w:proofErr w:type="gramEnd"/>
+      <w:r>
+        <w:t>.Driver</w:t>
+      </w:r>
+      <w:proofErr w:type="spellEnd"/>
+    </w:p>
+    <w:p>
+      <w:pPr>
+        <w:pStyle w:val="Code"/>
+      </w:pPr>
+      <w:r>
+        <w:t xml:space="preserve">    url: </w:t>
+      </w:r>
+      <w:proofErr w:type="spellStart"/>
+      <w:proofErr w:type="gramStart"/>
+      <w:r>
+        <w:t>jdbc:postgresql</w:t>
+      </w:r>
+      <w:proofErr w:type="spellEnd"/>
+      <w:r>
+        <w:t>://localhost:5432/students</w:t>
+      </w:r>
+      <w:proofErr w:type="gramEnd"/>
+    </w:p>
+    <w:p>
+      <w:pPr>
+        <w:pStyle w:val="Code"/>
+      </w:pPr>
+      <w:r>
+        <w:t xml:space="preserve">    username: username</w:t>
+      </w:r>
+    </w:p>
+    <w:p>
+      <w:pPr>
+        <w:pStyle w:val="Code"/>
+      </w:pPr>
+      <w:r>
+        <w:t xml:space="preserve">    password: password</w:t>
+      </w:r>
+    </w:p>
+    <w:p>
+      <w:pPr>
+        <w:pStyle w:val="Code"/>
+      </w:pPr>
+      <w:r>
+        <w:t xml:space="preserve">  </w:t>
+      </w:r>
+      <w:proofErr w:type="spellStart"/>
+      <w:r>
+        <w:t>jpa</w:t>
+      </w:r>
+      <w:proofErr w:type="spellEnd"/>
+      <w:r>
+        <w:t>:</w:t>
+      </w:r>
+    </w:p>
+    <w:p>
+      <w:pPr>
+        <w:pStyle w:val="Code"/>
+      </w:pPr>
+      <w:r>
+        <w:t xml:space="preserve">    hibernate:</w:t>
+      </w:r>
+    </w:p>
+    <w:p>
+      <w:pPr>
+        <w:pStyle w:val="Code"/>
+      </w:pPr>
+      <w:r>
+        <w:t xml:space="preserve">      </w:t>
+      </w:r>
+      <w:proofErr w:type="spellStart"/>
+      <w:r>
+        <w:t>ddl</w:t>
+      </w:r>
+      <w:proofErr w:type="spellEnd"/>
+      <w:r>
+        <w:t>-auto: create</w:t>
+      </w:r>
+    </w:p>
+    <w:p>
+      <w:pPr>
+        <w:pStyle w:val="Code"/>
+      </w:pPr>
+      <w:r>
+        <w:t xml:space="preserve">    database: </w:t>
+      </w:r>
+      <w:proofErr w:type="spellStart"/>
+      <w:r>
+        <w:t>postgresql</w:t>
+      </w:r>
+      <w:proofErr w:type="spellEnd"/>
+    </w:p>
+    <w:p>
+      <w:pPr>
+        <w:pStyle w:val="Code"/>
+      </w:pPr>
+      <w:r>
+        <w:t xml:space="preserve">    database-platform: </w:t>
+      </w:r>
+      <w:proofErr w:type="spellStart"/>
+      <w:proofErr w:type="gramStart"/>
+      <w:r>
+        <w:t>org.hibernate</w:t>
+      </w:r>
+      <w:proofErr w:type="gramEnd"/>
+      <w:r>
+        <w:t>.</w:t>
+      </w:r>
+      <w:proofErr w:type="gramStart"/>
+      <w:r>
+        <w:t>dialect.PostgreSQLDialect</w:t>
+      </w:r>
+      <w:proofErr w:type="spellEnd"/>
+      <w:proofErr w:type="gramEnd"/>
+    </w:p>
+    <w:p>
+      <w:pPr>
+        <w:pStyle w:val="paragraph"/>
+      </w:pPr>
+      <w:r>
+        <w:t xml:space="preserve">Don’t forget to change the </w:t>
+      </w:r>
+      <w:proofErr w:type="spellStart"/>
+      <w:proofErr w:type="gramStart"/>
+      <w:r>
+        <w:t>spring.datasource</w:t>
+      </w:r>
+      <w:proofErr w:type="gramEnd"/>
+      <w:r>
+        <w:t>.username</w:t>
+      </w:r>
+      <w:proofErr w:type="spellEnd"/>
+      <w:r>
+        <w:t xml:space="preserve"> and </w:t>
+      </w:r>
+      <w:proofErr w:type="spellStart"/>
+      <w:proofErr w:type="gramStart"/>
+      <w:r>
+        <w:t>spring.datasource</w:t>
+      </w:r>
+      <w:proofErr w:type="gramEnd"/>
+      <w:r>
+        <w:t>.password</w:t>
+      </w:r>
+      <w:proofErr w:type="spellEnd"/>
+      <w:r>
+        <w:t xml:space="preserve"> as per your PostgreSQL installation. Also, create a database named schools in PostgreSQL before proceeding to the next section.</w:t>
+      </w:r>
+    </w:p>
+    <w:p>
+      <w:pPr>
+        <w:pStyle w:val="paragraph"/>
+      </w:pPr>
+      <w:r>
+        <w:t xml:space="preserve">You don’t need to create any tables. The tables will automatically be created by Hibernate from the School entity that we will define in the next step. This is made possible by the property </w:t>
+      </w:r>
+      <w:proofErr w:type="spellStart"/>
+      <w:r>
+        <w:t>spring.jpa.hibernate.ddl</w:t>
+      </w:r>
+      <w:proofErr w:type="spellEnd"/>
+      <w:r>
+        <w:t>-auto = create.</w:t>
+      </w:r>
+    </w:p>
+    <w:p>
+      <w:pPr>
+        <w:pStyle w:val="subjects"/>
+      </w:pPr>
+      <w:r>
+        <w:t>Domain Layer - School JPA Entity</w:t>
+      </w:r>
+    </w:p>
+    <w:p>
+      <w:pPr>
+        <w:pStyle w:val="Code"/>
+      </w:pPr>
+      <w:r>
+        <w:t xml:space="preserve">import </w:t>
+      </w:r>
+      <w:proofErr w:type="spellStart"/>
+      <w:proofErr w:type="gramStart"/>
+      <w:r>
+        <w:t>jakarta.persistence</w:t>
+      </w:r>
+      <w:proofErr w:type="gramEnd"/>
+      <w:r>
+        <w:t>.Entity</w:t>
+      </w:r>
+      <w:proofErr w:type="spellEnd"/>
+      <w:r>
+        <w:t>;</w:t>
+      </w:r>
+    </w:p>
+    <w:p>
+      <w:pPr>
+        <w:pStyle w:val="Code"/>
+      </w:pPr>
+      <w:r>
+        <w:t xml:space="preserve">import </w:t>
+      </w:r>
+      <w:proofErr w:type="spellStart"/>
+      <w:proofErr w:type="gramStart"/>
+      <w:r>
+        <w:t>jakarta.persistence</w:t>
+      </w:r>
+      <w:proofErr w:type="gramEnd"/>
+      <w:r>
+        <w:t>.GeneratedValue</w:t>
+      </w:r>
+      <w:proofErr w:type="spellEnd"/>
+      <w:r>
+        <w:t>;</w:t>
+      </w:r>
+    </w:p>
+    <w:p>
+      <w:pPr>
+        <w:pStyle w:val="Code"/>
+      </w:pPr>
+      <w:r>
+        <w:t xml:space="preserve">import </w:t>
+      </w:r>
+      <w:proofErr w:type="spellStart"/>
+      <w:proofErr w:type="gramStart"/>
+      <w:r>
+        <w:t>jakarta.persistence</w:t>
+      </w:r>
+      <w:proofErr w:type="gramEnd"/>
+      <w:r>
+        <w:t>.Id</w:t>
+      </w:r>
+      <w:proofErr w:type="spellEnd"/>
+      <w:r>
+        <w:t>;</w:t>
+      </w:r>
+    </w:p>
+    <w:p>
+      <w:pPr>
+        <w:pStyle w:val="Code"/>
+      </w:pPr>
+      <w:r>
+        <w:t xml:space="preserve">import </w:t>
+      </w:r>
+      <w:proofErr w:type="spellStart"/>
+      <w:proofErr w:type="gramStart"/>
+      <w:r>
+        <w:t>lombok</w:t>
+      </w:r>
+      <w:proofErr w:type="spellEnd"/>
+      <w:r>
+        <w:t>.*</w:t>
+      </w:r>
+      <w:proofErr w:type="gramEnd"/>
+      <w:r>
+        <w:t>;</w:t>
+      </w:r>
+    </w:p>
+    <w:p>
+      <w:pPr>
+        <w:pStyle w:val="Code"/>
+      </w:pPr>
+    </w:p>
+    <w:p>
+      <w:pPr>
+        <w:pStyle w:val="Code"/>
+      </w:pPr>
+      <w:r>
+        <w:t>@Entity</w:t>
+      </w:r>
+    </w:p>
+    <w:p>
+      <w:pPr>
+        <w:pStyle w:val="Code"/>
+      </w:pPr>
+      <w:r>
+        <w:t>@Getter</w:t>
+      </w:r>
+    </w:p>
+    <w:p>
+      <w:pPr>
+        <w:pStyle w:val="Code"/>
+      </w:pPr>
+      <w:r>
+        <w:t>@Setter</w:t>
+      </w:r>
+    </w:p>
+    <w:p>
+      <w:pPr>
+        <w:pStyle w:val="Code"/>
+      </w:pPr>
+      <w:r>
+        <w:t>@AllArgsConstructor</w:t>
+      </w:r>
+    </w:p>
+    <w:p>
+      <w:pPr>
+        <w:pStyle w:val="Code"/>
+      </w:pPr>
+      <w:r>
+        <w:t>@NoArgsConstructor</w:t>
+      </w:r>
+    </w:p>
+    <w:p>
+      <w:pPr>
+        <w:pStyle w:val="Code"/>
+      </w:pPr>
+      <w:r>
+        <w:t>@Builder</w:t>
+      </w:r>
+    </w:p>
+    <w:p>
+      <w:pPr>
+        <w:pStyle w:val="Code"/>
+      </w:pPr>
+      <w:r>
+        <w:t>public class School {</w:t>
+      </w:r>
+    </w:p>
+    <w:p>
+      <w:pPr>
+        <w:pStyle w:val="Code"/>
+      </w:pPr>
+    </w:p>
+    <w:p>
+      <w:pPr>
+        <w:pStyle w:val="Code"/>
+      </w:pPr>
+      <w:r>
+        <w:t xml:space="preserve">    @Id</w:t>
+      </w:r>
+    </w:p>
+    <w:p>
+      <w:pPr>
+        <w:pStyle w:val="Code"/>
+      </w:pPr>
+      <w:r>
+        <w:t xml:space="preserve">    @GeneratedValue</w:t>
+      </w:r>
+    </w:p>
+    <w:p>
+      <w:pPr>
+        <w:pStyle w:val="Code"/>
+      </w:pPr>
+      <w:r>
+        <w:t xml:space="preserve">    private Integer id;</w:t>
+      </w:r>
+    </w:p>
+    <w:p>
+      <w:pPr>
+        <w:pStyle w:val="Code"/>
+      </w:pPr>
+      <w:r>
+        <w:t xml:space="preserve">    private String name;</w:t>
+      </w:r>
+    </w:p>
+    <w:p>
+      <w:pPr>
+        <w:pStyle w:val="Code"/>
+      </w:pPr>
+      <w:r>
+        <w:t xml:space="preserve">    private String email;</w:t>
+      </w:r>
+    </w:p>
+    <w:p>
+      <w:pPr>
+        <w:pStyle w:val="Code"/>
+      </w:pPr>
+      <w:r>
+        <w:t>}</w:t>
+      </w:r>
+    </w:p>
+    <w:p>
+      <w:pPr>
+        <w:pStyle w:val="subjects"/>
+      </w:pPr>
+      <w:r>
+        <w:t xml:space="preserve">Repository Layer </w:t>
+      </w:r>
+      <w:r>
+        <w:t>–</w:t>
+      </w:r>
+      <w:r>
+        <w:t xml:space="preserve"> </w:t>
+      </w:r>
+      <w:proofErr w:type="spellStart"/>
+      <w:r>
+        <w:t>SchoolRepository</w:t>
+      </w:r>
+      <w:proofErr w:type="spellEnd"/>
+    </w:p>
+    <w:p>
+      <w:pPr>
+        <w:pStyle w:val="Code"/>
+      </w:pPr>
+      <w:r>
+        <w:t xml:space="preserve">import </w:t>
+      </w:r>
+      <w:proofErr w:type="spellStart"/>
+      <w:proofErr w:type="gramStart"/>
+      <w:r>
+        <w:t>org.springframework.data.jpa.repository</w:t>
+      </w:r>
+      <w:proofErr w:type="gramEnd"/>
+      <w:r>
+        <w:t>.JpaRepository</w:t>
+      </w:r>
+      <w:proofErr w:type="spellEnd"/>
+      <w:r>
+        <w:t>;</w:t>
+      </w:r>
+    </w:p>
+    <w:p>
+      <w:pPr>
+        <w:pStyle w:val="Code"/>
+      </w:pPr>
+    </w:p>
+    <w:p>
+      <w:pPr>
+        <w:pStyle w:val="Code"/>
+      </w:pPr>
+      <w:r>
+        <w:t xml:space="preserve">public interface </w:t>
+      </w:r>
+      <w:proofErr w:type="spellStart"/>
+      <w:r>
+        <w:t>SchoolRepository</w:t>
+      </w:r>
+      <w:proofErr w:type="spellEnd"/>
+      <w:r>
+        <w:t xml:space="preserve"> extends </w:t>
+      </w:r>
+      <w:proofErr w:type="spellStart"/>
+      <w:r>
+        <w:t>JpaRepository</w:t>
+      </w:r>
+      <w:proofErr w:type="spellEnd"/>
+      <w:r>
+        <w:t>&lt;School, Integer&gt; {</w:t>
+      </w:r>
+    </w:p>
+    <w:p>
+      <w:pPr>
+        <w:pStyle w:val="Code"/>
+      </w:pPr>
+      <w:r>
+        <w:lastRenderedPageBreak/>
+        <w:t>}</w:t>
+      </w:r>
+    </w:p>
+    <w:p>
+      <w:pPr>
+        <w:pStyle w:val="subjects"/>
+      </w:pPr>
+      <w:r>
+        <w:t>Create a DTO Class</w:t>
+      </w:r>
+    </w:p>
+    <w:p>
+      <w:pPr>
+        <w:pStyle w:val="Code"/>
+      </w:pPr>
+      <w:r>
+        <w:t xml:space="preserve">import </w:t>
+      </w:r>
+      <w:proofErr w:type="spellStart"/>
+      <w:proofErr w:type="gramStart"/>
+      <w:r>
+        <w:t>lombok</w:t>
+      </w:r>
+      <w:proofErr w:type="spellEnd"/>
+      <w:r>
+        <w:t>.*</w:t>
+      </w:r>
+      <w:proofErr w:type="gramEnd"/>
+      <w:r>
+        <w:t>;</w:t>
+      </w:r>
+    </w:p>
+    <w:p>
+      <w:pPr>
+        <w:pStyle w:val="Code"/>
+      </w:pPr>
+    </w:p>
+    <w:p>
+      <w:pPr>
+        <w:pStyle w:val="Code"/>
+      </w:pPr>
+      <w:r>
+        <w:t xml:space="preserve">import </w:t>
+      </w:r>
+      <w:proofErr w:type="spellStart"/>
+      <w:proofErr w:type="gramStart"/>
+      <w:r>
+        <w:t>java.util</w:t>
+      </w:r>
+      <w:proofErr w:type="gramEnd"/>
+      <w:r>
+        <w:t>.List</w:t>
+      </w:r>
+      <w:proofErr w:type="spellEnd"/>
+      <w:r>
+        <w:t>;</w:t>
+      </w:r>
+    </w:p>
+    <w:p>
+      <w:pPr>
+        <w:pStyle w:val="Code"/>
+      </w:pPr>
+    </w:p>
+    <w:p>
+      <w:pPr>
+        <w:pStyle w:val="Code"/>
+      </w:pPr>
+      <w:r>
+        <w:t>@Getter</w:t>
+      </w:r>
+    </w:p>
+    <w:p>
+      <w:pPr>
+        <w:pStyle w:val="Code"/>
+      </w:pPr>
+      <w:r>
+        <w:t>@Setter</w:t>
+      </w:r>
+    </w:p>
+    <w:p>
+      <w:pPr>
+        <w:pStyle w:val="Code"/>
+      </w:pPr>
+      <w:r>
+        <w:t>@AllArgsConstructor</w:t>
+      </w:r>
+    </w:p>
+    <w:p>
+      <w:pPr>
+        <w:pStyle w:val="Code"/>
+      </w:pPr>
+      <w:r>
+        <w:t>@NoArgsConstructor</w:t>
+      </w:r>
+    </w:p>
+    <w:p>
+      <w:pPr>
+        <w:pStyle w:val="Code"/>
+      </w:pPr>
+      <w:r>
+        <w:t>@Builder</w:t>
+      </w:r>
+    </w:p>
+    <w:p>
+      <w:pPr>
+        <w:pStyle w:val="Code"/>
+      </w:pPr>
+      <w:r>
+        <w:t xml:space="preserve">public class </w:t>
+      </w:r>
+      <w:proofErr w:type="spellStart"/>
+      <w:r>
+        <w:t>FullSchoolResponse</w:t>
+      </w:r>
+      <w:proofErr w:type="spellEnd"/>
+      <w:r>
+        <w:t xml:space="preserve"> {</w:t>
+      </w:r>
+    </w:p>
+    <w:p>
+      <w:pPr>
+        <w:pStyle w:val="Code"/>
+      </w:pPr>
+    </w:p>
+    <w:p>
+      <w:pPr>
+        <w:pStyle w:val="Code"/>
+      </w:pPr>
+      <w:r>
+        <w:t xml:space="preserve">    private String name;</w:t>
+      </w:r>
+    </w:p>
+    <w:p>
+      <w:pPr>
+        <w:pStyle w:val="Code"/>
+      </w:pPr>
+      <w:r>
+        <w:t xml:space="preserve">    private String email;</w:t>
+      </w:r>
+    </w:p>
+    <w:p>
+      <w:pPr>
+        <w:pStyle w:val="Code"/>
+      </w:pPr>
+      <w:r>
+        <w:t xml:space="preserve">    List&lt;Student&gt; students;</w:t>
+      </w:r>
+    </w:p>
+    <w:p>
+      <w:pPr>
+        <w:pStyle w:val="Code"/>
+      </w:pPr>
+      <w:r>
+        <w:t>}</w:t>
+      </w:r>
+    </w:p>
+    <w:p>
+      <w:pPr>
+        <w:pStyle w:val="subjects"/>
+      </w:pPr>
+      <w:r>
+        <w:t xml:space="preserve">Service Layer </w:t>
+      </w:r>
+      <w:r>
+        <w:t>–</w:t>
+      </w:r>
+      <w:r>
+        <w:t xml:space="preserve"> </w:t>
+      </w:r>
+      <w:proofErr w:type="spellStart"/>
+      <w:r>
+        <w:t>SchoolService</w:t>
+      </w:r>
+      <w:proofErr w:type="spellEnd"/>
+    </w:p>
+    <w:p>
+      <w:pPr>
+        <w:pStyle w:val="Code"/>
+      </w:pPr>
+      <w:r>
+        <w:t xml:space="preserve">import </w:t>
+      </w:r>
+      <w:proofErr w:type="spellStart"/>
+      <w:proofErr w:type="gramStart"/>
+      <w:r>
+        <w:t>lombok.RequiredArgsConstructor</w:t>
+      </w:r>
+      <w:proofErr w:type="spellEnd"/>
+      <w:proofErr w:type="gramEnd"/>
+      <w:r>
+        <w:t>;</w:t>
+      </w:r>
+    </w:p>
+    <w:p>
+      <w:pPr>
+        <w:pStyle w:val="Code"/>
+      </w:pPr>
+      <w:r>
+        <w:t xml:space="preserve">import </w:t>
+      </w:r>
+      <w:proofErr w:type="spellStart"/>
+      <w:proofErr w:type="gramStart"/>
+      <w:r>
+        <w:t>org.springframework</w:t>
+      </w:r>
+      <w:proofErr w:type="gramEnd"/>
+      <w:r>
+        <w:t>.</w:t>
+      </w:r>
+      <w:proofErr w:type="gramStart"/>
+      <w:r>
+        <w:t>stereotype.Service</w:t>
+      </w:r>
+      <w:proofErr w:type="spellEnd"/>
+      <w:proofErr w:type="gramEnd"/>
+      <w:r>
+        <w:t>;</w:t>
+      </w:r>
+    </w:p>
+    <w:p>
+      <w:pPr>
+        <w:pStyle w:val="Code"/>
+      </w:pPr>
+    </w:p>
+    <w:p>
+      <w:pPr>
+        <w:pStyle w:val="Code"/>
+      </w:pPr>
+      <w:r>
+        <w:t xml:space="preserve">import </w:t>
+      </w:r>
+      <w:proofErr w:type="spellStart"/>
+      <w:proofErr w:type="gramStart"/>
+      <w:r>
+        <w:t>java.util</w:t>
+      </w:r>
+      <w:proofErr w:type="gramEnd"/>
+      <w:r>
+        <w:t>.List</w:t>
+      </w:r>
+      <w:proofErr w:type="spellEnd"/>
+      <w:r>
+        <w:t>;</w:t>
+      </w:r>
+    </w:p>
+    <w:p>
+      <w:pPr>
+        <w:pStyle w:val="Code"/>
+      </w:pPr>
+    </w:p>
+    <w:p>
+      <w:pPr>
+        <w:pStyle w:val="Code"/>
+      </w:pPr>
+      <w:r>
+        <w:t>@Service</w:t>
+      </w:r>
+    </w:p>
+    <w:p>
+      <w:pPr>
+        <w:pStyle w:val="Code"/>
+      </w:pPr>
+      <w:r>
+        <w:t>@RequiredArgsConstructor</w:t>
+      </w:r>
+    </w:p>
+    <w:p>
+      <w:pPr>
+        <w:pStyle w:val="Code"/>
+      </w:pPr>
+      <w:r>
+        <w:t xml:space="preserve">public class </w:t>
+      </w:r>
+      <w:proofErr w:type="spellStart"/>
+      <w:r>
+        <w:t>SchoolService</w:t>
+      </w:r>
+      <w:proofErr w:type="spellEnd"/>
+      <w:r>
+        <w:t xml:space="preserve"> {</w:t>
+      </w:r>
+    </w:p>
+    <w:p>
+      <w:pPr>
+        <w:pStyle w:val="Code"/>
+      </w:pPr>
+    </w:p>
+    <w:p>
+      <w:pPr>
+        <w:pStyle w:val="Code"/>
+      </w:pPr>
+      <w:r>
+        <w:t xml:space="preserve">    private final </w:t>
+      </w:r>
+      <w:proofErr w:type="spellStart"/>
+      <w:r>
+        <w:t>SchoolRepository</w:t>
+      </w:r>
+      <w:proofErr w:type="spellEnd"/>
+      <w:r>
+        <w:t xml:space="preserve"> repository;</w:t>
+      </w:r>
+    </w:p>
+    <w:p>
+      <w:pPr>
+        <w:pStyle w:val="Code"/>
+      </w:pPr>
+      <w:r>
+        <w:t xml:space="preserve">    private final </w:t>
+      </w:r>
+      <w:proofErr w:type="spellStart"/>
+      <w:r>
+        <w:t>StudentClient</w:t>
+      </w:r>
+      <w:proofErr w:type="spellEnd"/>
+      <w:r>
+        <w:t xml:space="preserve"> client;</w:t>
+      </w:r>
+    </w:p>
+    <w:p>
+      <w:pPr>
+        <w:pStyle w:val="Code"/>
+      </w:pPr>
+    </w:p>
+    <w:p>
+      <w:pPr>
+        <w:pStyle w:val="Code"/>
+      </w:pPr>
+      <w:r>
+        <w:t xml:space="preserve">    public void </w:t>
+      </w:r>
+      <w:proofErr w:type="spellStart"/>
+      <w:proofErr w:type="gramStart"/>
+      <w:r>
+        <w:t>saveSchool</w:t>
+      </w:r>
+      <w:proofErr w:type="spellEnd"/>
+      <w:r>
+        <w:t>(</w:t>
+      </w:r>
+      <w:proofErr w:type="gramEnd"/>
+      <w:r>
+        <w:t>School school) {</w:t>
+      </w:r>
+    </w:p>
+    <w:p>
+      <w:pPr>
+        <w:pStyle w:val="Code"/>
+      </w:pPr>
+      <w:r>
+        <w:t xml:space="preserve">        </w:t>
+      </w:r>
+      <w:proofErr w:type="spellStart"/>
+      <w:proofErr w:type="gramStart"/>
+      <w:r>
+        <w:t>repository.save</w:t>
+      </w:r>
+      <w:proofErr w:type="spellEnd"/>
+      <w:proofErr w:type="gramEnd"/>
+      <w:r>
+        <w:t>(school);</w:t>
+      </w:r>
+    </w:p>
+    <w:p>
+      <w:pPr>
+        <w:pStyle w:val="Code"/>
+      </w:pPr>
+      <w:r>
+        <w:t xml:space="preserve">    }</w:t>
+      </w:r>
+    </w:p>
+    <w:p>
+      <w:pPr>
+        <w:pStyle w:val="Code"/>
+      </w:pPr>
+    </w:p>
+    <w:p>
+      <w:pPr>
+        <w:pStyle w:val="Code"/>
+      </w:pPr>
+      <w:r>
+        <w:t xml:space="preserve">    public List&lt;School&gt; </w:t>
+      </w:r>
+      <w:proofErr w:type="spellStart"/>
+      <w:proofErr w:type="gramStart"/>
+      <w:r>
+        <w:t>findAllSchools</w:t>
+      </w:r>
+      <w:proofErr w:type="spellEnd"/>
+      <w:r>
+        <w:t>(</w:t>
+      </w:r>
+      <w:proofErr w:type="gramEnd"/>
+      <w:r>
+        <w:t>) {</w:t>
+      </w:r>
+    </w:p>
+    <w:p>
+      <w:pPr>
+        <w:pStyle w:val="Code"/>
+      </w:pPr>
+      <w:r>
+        <w:t xml:space="preserve">        return </w:t>
+      </w:r>
+      <w:proofErr w:type="spellStart"/>
+      <w:proofErr w:type="gramStart"/>
+      <w:r>
+        <w:t>repository.findAll</w:t>
+      </w:r>
+      <w:proofErr w:type="spellEnd"/>
+      <w:proofErr w:type="gramEnd"/>
+      <w:r>
+        <w:t>();</w:t>
+      </w:r>
+    </w:p>
+    <w:p>
+      <w:pPr>
+        <w:pStyle w:val="Code"/>
+      </w:pPr>
+      <w:r>
+        <w:t xml:space="preserve">    }</w:t>
+      </w:r>
+    </w:p>
+    <w:p>
+      <w:pPr>
+        <w:pStyle w:val="Code"/>
+      </w:pPr>
+      <w:r>
+        <w:t>}</w:t>
+      </w:r>
+    </w:p>
+    <w:p>
+      <w:pPr>
+        <w:pStyle w:val="subjects"/>
+      </w:pPr>
+      <w:r>
+        <w:t xml:space="preserve">Controller Layer </w:t>
+      </w:r>
+      <w:r>
+        <w:t>–</w:t>
+      </w:r>
+      <w:r>
+        <w:t xml:space="preserve"> </w:t>
+      </w:r>
+      <w:proofErr w:type="spellStart"/>
+      <w:r>
+        <w:t>SchoolController</w:t>
+      </w:r>
+      <w:proofErr w:type="spellEnd"/>
+    </w:p>
+    <w:p>
+      <w:pPr>
+        <w:pStyle w:val="Code"/>
+      </w:pPr>
+      <w:r>
+        <w:t xml:space="preserve">import </w:t>
+      </w:r>
+      <w:proofErr w:type="spellStart"/>
+      <w:proofErr w:type="gramStart"/>
+      <w:r>
+        <w:t>lombok.RequiredArgsConstructor</w:t>
+      </w:r>
+      <w:proofErr w:type="spellEnd"/>
+      <w:proofErr w:type="gramEnd"/>
+      <w:r>
+        <w:t>;</w:t>
+      </w:r>
+    </w:p>
+    <w:p>
+      <w:pPr>
+        <w:pStyle w:val="Code"/>
+      </w:pPr>
+      <w:r>
+        <w:t xml:space="preserve">import </w:t>
+      </w:r>
+      <w:proofErr w:type="spellStart"/>
+      <w:proofErr w:type="gramStart"/>
+      <w:r>
+        <w:t>org.springframework</w:t>
+      </w:r>
+      <w:proofErr w:type="gramEnd"/>
+      <w:r>
+        <w:t>.</w:t>
+      </w:r>
+      <w:proofErr w:type="gramStart"/>
+      <w:r>
+        <w:t>http.HttpStatus</w:t>
+      </w:r>
+      <w:proofErr w:type="spellEnd"/>
+      <w:proofErr w:type="gramEnd"/>
+      <w:r>
+        <w:t>;</w:t>
+      </w:r>
+    </w:p>
+    <w:p>
+      <w:pPr>
+        <w:pStyle w:val="Code"/>
+      </w:pPr>
+      <w:r>
+        <w:t xml:space="preserve">import </w:t>
+      </w:r>
+      <w:proofErr w:type="spellStart"/>
+      <w:proofErr w:type="gramStart"/>
+      <w:r>
+        <w:t>org.springframework</w:t>
+      </w:r>
+      <w:proofErr w:type="gramEnd"/>
+      <w:r>
+        <w:t>.</w:t>
+      </w:r>
+      <w:proofErr w:type="gramStart"/>
+      <w:r>
+        <w:t>http.ResponseEntity</w:t>
+      </w:r>
+      <w:proofErr w:type="spellEnd"/>
+      <w:proofErr w:type="gramEnd"/>
+      <w:r>
+        <w:t>;</w:t>
+      </w:r>
+    </w:p>
+    <w:p>
+      <w:pPr>
+        <w:pStyle w:val="Code"/>
+      </w:pPr>
+      <w:r>
+        <w:t xml:space="preserve">import </w:t>
+      </w:r>
+      <w:proofErr w:type="spellStart"/>
+      <w:proofErr w:type="gramStart"/>
+      <w:r>
+        <w:t>org.springframework.web.bind</w:t>
+      </w:r>
+      <w:proofErr w:type="gramEnd"/>
+      <w:r>
+        <w:t>.</w:t>
+      </w:r>
+      <w:proofErr w:type="gramStart"/>
+      <w:r>
+        <w:t>annotation</w:t>
+      </w:r>
+      <w:proofErr w:type="spellEnd"/>
+      <w:r>
+        <w:t>.*</w:t>
+      </w:r>
+      <w:proofErr w:type="gramEnd"/>
+      <w:r>
+        <w:t>;</w:t>
+      </w:r>
+    </w:p>
+    <w:p>
+      <w:pPr>
+        <w:pStyle w:val="Code"/>
+      </w:pPr>
+    </w:p>
+    <w:p>
+      <w:pPr>
+        <w:pStyle w:val="Code"/>
+      </w:pPr>
+      <w:r>
+        <w:t xml:space="preserve">import </w:t>
+      </w:r>
+      <w:proofErr w:type="spellStart"/>
+      <w:proofErr w:type="gramStart"/>
+      <w:r>
+        <w:t>java.util</w:t>
+      </w:r>
+      <w:proofErr w:type="gramEnd"/>
+      <w:r>
+        <w:t>.List</w:t>
+      </w:r>
+      <w:proofErr w:type="spellEnd"/>
+      <w:r>
+        <w:t>;</w:t>
+      </w:r>
+    </w:p>
+    <w:p>
+      <w:pPr>
+        <w:pStyle w:val="Code"/>
+      </w:pPr>
+    </w:p>
+    <w:p>
+      <w:pPr>
+        <w:pStyle w:val="Code"/>
+      </w:pPr>
+      <w:r>
+        <w:t>@RestController</w:t>
+      </w:r>
+    </w:p>
+    <w:p>
+      <w:pPr>
+        <w:pStyle w:val="Code"/>
+      </w:pPr>
+      <w:r>
+        <w:lastRenderedPageBreak/>
+        <w:t>@RequestMapping("/api/v1/schools")</w:t>
+      </w:r>
+    </w:p>
+    <w:p>
+      <w:pPr>
+        <w:pStyle w:val="Code"/>
+      </w:pPr>
+      <w:r>
+        <w:t>@RequiredArgsConstructor</w:t>
+      </w:r>
+    </w:p>
+    <w:p>
+      <w:pPr>
+        <w:pStyle w:val="Code"/>
+      </w:pPr>
+      <w:r>
+        <w:t xml:space="preserve">public class </w:t>
+      </w:r>
+      <w:proofErr w:type="spellStart"/>
+      <w:r>
+        <w:t>SchoolController</w:t>
+      </w:r>
+      <w:proofErr w:type="spellEnd"/>
+      <w:r>
+        <w:t xml:space="preserve"> {</w:t>
+      </w:r>
+    </w:p>
+    <w:p>
+      <w:pPr>
+        <w:pStyle w:val="Code"/>
+      </w:pPr>
+    </w:p>
+    <w:p>
+      <w:pPr>
+        <w:pStyle w:val="Code"/>
+      </w:pPr>
+      <w:r>
+        <w:t xml:space="preserve">    private final </w:t>
+      </w:r>
+      <w:proofErr w:type="spellStart"/>
+      <w:r>
+        <w:t>SchoolService</w:t>
+      </w:r>
+      <w:proofErr w:type="spellEnd"/>
+      <w:r>
+        <w:t xml:space="preserve"> service;</w:t>
+      </w:r>
+    </w:p>
+    <w:p>
+      <w:pPr>
+        <w:pStyle w:val="Code"/>
+      </w:pPr>
+    </w:p>
+    <w:p>
+      <w:pPr>
+        <w:pStyle w:val="Code"/>
+      </w:pPr>
+      <w:r>
+        <w:t xml:space="preserve">    @PostMapping</w:t>
+      </w:r>
+    </w:p>
+    <w:p>
+      <w:pPr>
+        <w:pStyle w:val="Code"/>
+      </w:pPr>
+      <w:r>
+        <w:t xml:space="preserve">    @</w:t>
+      </w:r>
+      <w:proofErr w:type="gramStart"/>
+      <w:r>
+        <w:t>ResponseStatus(</w:t>
+      </w:r>
+      <w:proofErr w:type="gramEnd"/>
+      <w:r>
+        <w:t>HttpStatus.CREATED)</w:t>
+      </w:r>
+    </w:p>
+    <w:p>
+      <w:pPr>
+        <w:pStyle w:val="Code"/>
+      </w:pPr>
+      <w:r>
+        <w:t xml:space="preserve">    public void </w:t>
+      </w:r>
+      <w:proofErr w:type="gramStart"/>
+      <w:r>
+        <w:t>save(</w:t>
+      </w:r>
+      <w:proofErr w:type="gramEnd"/>
+    </w:p>
+    <w:p>
+      <w:pPr>
+        <w:pStyle w:val="Code"/>
+      </w:pPr>
+      <w:r>
+        <w:t xml:space="preserve">            @RequestBody School </w:t>
+      </w:r>
+      <w:proofErr w:type="spellStart"/>
+      <w:r>
+        <w:t>school</w:t>
+      </w:r>
+      <w:proofErr w:type="spellEnd"/>
+    </w:p>
+    <w:p>
+      <w:pPr>
+        <w:pStyle w:val="Code"/>
+      </w:pPr>
+      <w:r>
+        <w:t xml:space="preserve">    ) {</w:t>
+      </w:r>
+    </w:p>
+    <w:p>
+      <w:pPr>
+        <w:pStyle w:val="Code"/>
+      </w:pPr>
+      <w:r>
+        <w:t xml:space="preserve">        </w:t>
+      </w:r>
+      <w:proofErr w:type="spellStart"/>
+      <w:proofErr w:type="gramStart"/>
+      <w:r>
+        <w:t>service.saveSchool</w:t>
+      </w:r>
+      <w:proofErr w:type="spellEnd"/>
+      <w:proofErr w:type="gramEnd"/>
+      <w:r>
+        <w:t>(school);</w:t>
+      </w:r>
+    </w:p>
+    <w:p>
+      <w:pPr>
+        <w:pStyle w:val="Code"/>
+      </w:pPr>
+      <w:r>
+        <w:t xml:space="preserve">    }</w:t>
+      </w:r>
+    </w:p>
+    <w:p>
+      <w:pPr>
+        <w:pStyle w:val="Code"/>
+      </w:pPr>
+    </w:p>
+    <w:p>
+      <w:pPr>
+        <w:pStyle w:val="Code"/>
+      </w:pPr>
+      <w:r>
+        <w:t xml:space="preserve">    @GetMapping</w:t>
+      </w:r>
+    </w:p>
+    <w:p>
+      <w:pPr>
+        <w:pStyle w:val="Code"/>
+      </w:pPr>
+      <w:r>
+        <w:t xml:space="preserve">    public </w:t>
+      </w:r>
+      <w:proofErr w:type="spellStart"/>
+      <w:r>
+        <w:t>ResponseEntity</w:t>
+      </w:r>
+      <w:proofErr w:type="spellEnd"/>
+      <w:r>
+        <w:t xml:space="preserve">&lt;List&lt;School&gt;&gt; </w:t>
+      </w:r>
+      <w:proofErr w:type="spellStart"/>
+      <w:proofErr w:type="gramStart"/>
+      <w:r>
+        <w:t>findAllSchools</w:t>
+      </w:r>
+      <w:proofErr w:type="spellEnd"/>
+      <w:r>
+        <w:t>(</w:t>
+      </w:r>
+      <w:proofErr w:type="gramEnd"/>
+      <w:r>
+        <w:t>) {</w:t>
+      </w:r>
+    </w:p>
+    <w:p>
+      <w:pPr>
+        <w:pStyle w:val="Code"/>
+      </w:pPr>
+      <w:r>
+        <w:t xml:space="preserve">        return </w:t>
+      </w:r>
+      <w:proofErr w:type="spellStart"/>
+      <w:r>
+        <w:t>ResponseEntity.ok</w:t>
+      </w:r>
+      <w:proofErr w:type="spellEnd"/>
+      <w:r>
+        <w:t>(</w:t>
+      </w:r>
+      <w:proofErr w:type="spellStart"/>
+      <w:proofErr w:type="gramStart"/>
+      <w:r>
+        <w:t>service.findAllSchools</w:t>
+      </w:r>
+      <w:proofErr w:type="spellEnd"/>
+      <w:proofErr w:type="gramEnd"/>
+      <w:r>
+        <w:t>());</w:t>
+      </w:r>
+    </w:p>
+    <w:p>
+      <w:pPr>
+        <w:pStyle w:val="Code"/>
+      </w:pPr>
+      <w:r>
+        <w:t xml:space="preserve">    }</w:t>
+      </w:r>
+    </w:p>
+    <w:p>
+      <w:pPr>
+        <w:pStyle w:val="Code"/>
+      </w:pPr>
+      <w:r>
+        <w:t>}</w:t>
+      </w:r>
+    </w:p>
+    <w:p>
+      <w:pPr>
+        <w:pStyle w:val="paragraph"/>
+      </w:pPr>
+      <w:r>
+        <w:t>That's completed our school microservice development.</w:t>
       </w:r>
     </w:p>
     <w:sectPr>
@@ -4837,4 +7740,16 @@
     </a:ext>
   </a:extLst>
 </a:theme>
+</file>
+
+<file path=customXml/item1.xml><?xml version="1.0" encoding="utf-8"?>
+<b:Sources xmlns:b="http://schemas.openxmlformats.org/officeDocument/2006/bibliography" xmlns="http://schemas.openxmlformats.org/officeDocument/2006/bibliography" SelectedStyle="\APASixthEditionOfficeOnline.xsl" StyleName="APA" Version="6"/>
+</file>
+
+<file path=customXml/itemProps1.xml><?xml version="1.0" encoding="utf-8"?>
+<ds:datastoreItem xmlns:ds="http://schemas.openxmlformats.org/officeDocument/2006/customXml" ds:itemID="{A1CA1AA5-609F-49BE-B629-8DCF13E3739A}">
+  <ds:schemaRefs>
+    <ds:schemaRef ds:uri="http://schemas.openxmlformats.org/officeDocument/2006/bibliography"/>
+  </ds:schemaRefs>
+</ds:datastoreItem>
 </file>
</xml_diff>

<commit_message>
change service and create Api Client
</commit_message>
<xml_diff>
--- a/Microservices Project using Spring Boot.docx
+++ b/Microservices Project using Spring Boot.docx
@@ -6259,6 +6259,91 @@
       <w:r>
         <w:t>That's completed our school microservice development.</w:t>
       </w:r>
+    </w:p>
+    <w:p>
+      <w:pPr>
+        <w:pStyle w:val="headersub"/>
+      </w:pPr>
+      <w:r>
+        <w:t xml:space="preserve">Using </w:t>
+      </w:r>
+      <w:proofErr w:type="spellStart"/>
+      <w:r>
+        <w:t>OpenFeign</w:t>
+      </w:r>
+      <w:proofErr w:type="spellEnd"/>
+      <w:r>
+        <w:t xml:space="preserve"> - Inter-Service Communication</w:t>
+      </w:r>
+    </w:p>
+    <w:p>
+      <w:pPr>
+        <w:pStyle w:val="paragraph"/>
+      </w:pPr>
+      <w:r>
+        <w:t xml:space="preserve">In this section, we will see the inter-service communication using </w:t>
+      </w:r>
+      <w:proofErr w:type="spellStart"/>
+      <w:r>
+        <w:t>OpenFeign</w:t>
+      </w:r>
+      <w:proofErr w:type="spellEnd"/>
+      <w:r>
+        <w:t>, a declarative REST client that simplifies service-to-service communication within the microservices ecosystem.</w:t>
+      </w:r>
+    </w:p>
+    <w:p>
+      <w:pPr>
+        <w:pStyle w:val="paragraph"/>
+      </w:pPr>
+      <w:r>
+        <w:t xml:space="preserve">We will see how to use the </w:t>
+      </w:r>
+      <w:proofErr w:type="spellStart"/>
+      <w:r>
+        <w:t>OpenFeign</w:t>
+      </w:r>
+      <w:proofErr w:type="spellEnd"/>
+      <w:r>
+        <w:t xml:space="preserve"> library to make a REST API call from school service to student service.</w:t>
+      </w:r>
+    </w:p>
+    <w:p>
+      <w:pPr>
+        <w:pStyle w:val="subjects"/>
+      </w:pPr>
+      <w:r>
+        <w:t xml:space="preserve">Add </w:t>
+      </w:r>
+      <w:proofErr w:type="spellStart"/>
+      <w:r>
+        <w:t>OpenFeign</w:t>
+      </w:r>
+      <w:proofErr w:type="spellEnd"/>
+      <w:r>
+        <w:t xml:space="preserve"> Dependency</w:t>
+      </w:r>
+    </w:p>
+    <w:p>
+      <w:pPr>
+        <w:pStyle w:val="paragraph"/>
+      </w:pPr>
+      <w:r>
+        <w:t xml:space="preserve">In order to use the </w:t>
+      </w:r>
+      <w:proofErr w:type="spellStart"/>
+      <w:r>
+        <w:t>OpenFeign</w:t>
+      </w:r>
+      <w:proofErr w:type="spellEnd"/>
+      <w:r>
+        <w:t xml:space="preserve"> library, open the pom.xml file of the school service project and add the below dependency:</w:t>
+      </w:r>
+    </w:p>
+    <w:p>
+      <w:pPr>
+        <w:pStyle w:val="paragraph"/>
+      </w:pPr>
     </w:p>
     <w:sectPr>
       <w:pgSz w:w="11906" w:h="16838"/>

</xml_diff>